<commit_message>
docs: Homebrew cask moved to hov172/displayhelp; regenerated guides
</commit_message>
<xml_diff>
--- a/DisplayHelp-0.6.10-User-Guide.docx
+++ b/DisplayHelp-0.6.10-User-Guide.docx
@@ -2,7 +2,7 @@
 <file path=word/document.xml><?xml version="1.0" encoding="utf-8"?>
 <w:document xmlns:w="http://schemas.openxmlformats.org/wordprocessingml/2006/main" xmlns:m="http://schemas.openxmlformats.org/officeDocument/2006/math" xmlns:r="http://schemas.openxmlformats.org/officeDocument/2006/relationships" xmlns:o="urn:schemas-microsoft-com:office:office" xmlns:v="urn:schemas-microsoft-com:vml" xmlns:w10="urn:schemas-microsoft-com:office:word" xmlns:a="http://schemas.openxmlformats.org/drawingml/2006/main" xmlns:pic="http://schemas.openxmlformats.org/drawingml/2006/picture" xmlns:wp="http://schemas.openxmlformats.org/drawingml/2006/wordprocessingDrawing">
   <w:body>
-    <w:bookmarkStart w:id="137" w:name="displayhelp-0.6.10-user-guide"/>
+    <w:bookmarkStart w:id="138" w:name="displayhelp-0.6.10-user-guide"/>
     <w:p>
       <w:pPr>
         <w:pStyle w:val="Heading1"/>
@@ -376,7 +376,7 @@
         <w:rPr>
           <w:rStyle w:val="NormalTok"/>
         </w:rPr>
-        <w:t xml:space="preserve"> tap hov172/signaro</w:t>
+        <w:t xml:space="preserve"> tap hov172/displayhelp</w:t>
       </w:r>
       <w:r>
         <w:br/>
@@ -391,7 +391,7 @@
         <w:rPr>
           <w:rStyle w:val="NormalTok"/>
         </w:rPr>
-        <w:t xml:space="preserve"> trust hov172/signaro   </w:t>
+        <w:t xml:space="preserve"> trust hov172/displayhelp   </w:t>
       </w:r>
       <w:r>
         <w:rPr>
@@ -7320,7 +7320,7 @@
       </w:r>
     </w:p>
     <w:bookmarkEnd w:id="115"/>
-    <w:bookmarkStart w:id="120" w:name="start-at-login-quit-about"/>
+    <w:bookmarkStart w:id="121" w:name="start-at-login-quit-about"/>
     <w:p>
       <w:pPr>
         <w:pStyle w:val="Heading2"/>
@@ -7442,7 +7442,7 @@
         <w:t xml:space="preserve">link opens the About panel.</w:t>
       </w:r>
     </w:p>
-    <w:bookmarkStart w:id="119" w:name="check-for-update"/>
+    <w:bookmarkStart w:id="120" w:name="check-for-update"/>
     <w:p>
       <w:pPr>
         <w:pStyle w:val="Heading3"/>
@@ -7607,9 +7607,43 @@
         <w:t xml:space="preserve">still works and the downloaded package asks for an administrator password as before.</w:t>
       </w:r>
     </w:p>
-    <w:bookmarkEnd w:id="119"/>
+    <w:p>
+      <w:pPr>
+        <w:pStyle w:val="BodyText"/>
+      </w:pPr>
+      <w:r>
+        <w:t xml:space="preserve">Managed Macs can skip the approval step: an MDM can pre-approve DisplayHelp Updater with a Service Management profile</w:t>
+      </w:r>
+      <w:r>
+        <w:t xml:space="preserve"> </w:t>
+      </w:r>
+      <w:r>
+        <w:t xml:space="preserve">(see the</w:t>
+      </w:r>
+      <w:r>
+        <w:t xml:space="preserve"> </w:t>
+      </w:r>
+      <w:hyperlink r:id="rId119">
+        <w:r>
+          <w:rPr>
+            <w:rStyle w:val="Hyperlink"/>
+          </w:rPr>
+          <w:t xml:space="preserve">rollout guide</w:t>
+        </w:r>
+      </w:hyperlink>
+      <w:r>
+        <w:t xml:space="preserve">), after which Install appears for</w:t>
+      </w:r>
+      <w:r>
+        <w:t xml:space="preserve"> </w:t>
+      </w:r>
+      <w:r>
+        <w:t xml:space="preserve">every account without anyone visiting System Settings.</w:t>
+      </w:r>
+    </w:p>
     <w:bookmarkEnd w:id="120"/>
-    <w:bookmarkStart w:id="124" w:name="the-connect-dialog"/>
+    <w:bookmarkEnd w:id="121"/>
+    <w:bookmarkStart w:id="125" w:name="the-connect-dialog"/>
     <w:p>
       <w:pPr>
         <w:pStyle w:val="Heading2"/>
@@ -7627,18 +7661,18 @@
           <wp:inline>
             <wp:extent cx="2476469" cy="3028912"/>
             <wp:effectExtent b="0" l="0" r="0" t="0"/>
-            <wp:docPr descr="DisplayHelp 0.6.6: First-connection prompt using a sample display" title="" id="122" name="Picture"/>
+            <wp:docPr descr="DisplayHelp 0.6.6: First-connection prompt using a sample display" title="" id="123" name="Picture"/>
             <a:graphic>
               <a:graphicData uri="http://schemas.openxmlformats.org/drawingml/2006/picture">
                 <pic:pic>
                   <pic:nvPicPr>
-                    <pic:cNvPr descr="/Users/helpdesk/Developer/GitHub/DisplayHelp/docs/images/first-connect.png" id="123" name="Picture"/>
+                    <pic:cNvPr descr="/Users/helpdesk/Developer/GitHub/DisplayHelp/docs/images/first-connect.png" id="124" name="Picture"/>
                     <pic:cNvPicPr>
                       <a:picLocks noChangeArrowheads="1" noChangeAspect="1"/>
                     </pic:cNvPicPr>
                   </pic:nvPicPr>
                   <pic:blipFill>
-                    <a:blip r:embed="rId121"/>
+                    <a:blip r:embed="rId122"/>
                     <a:stretch>
                       <a:fillRect/>
                     </a:stretch>
@@ -7761,8 +7795,8 @@
         <w:t xml:space="preserve">mirroring, Best for Display when extending.</w:t>
       </w:r>
     </w:p>
-    <w:bookmarkEnd w:id="124"/>
-    <w:bookmarkStart w:id="125" w:name="Xc6bbff7ca76b967f9df64a308f1bdb464fe71e0"/>
+    <w:bookmarkEnd w:id="125"/>
+    <w:bookmarkStart w:id="126" w:name="Xc6bbff7ca76b967f9df64a308f1bdb464fe71e0"/>
     <w:p>
       <w:pPr>
         <w:pStyle w:val="Heading2"/>
@@ -8122,8 +8156,8 @@
         <w:t xml:space="preserve">modes; explicitly loading a profile attempts the exact saved mode and verifies the result.</w:t>
       </w:r>
     </w:p>
-    <w:bookmarkEnd w:id="125"/>
-    <w:bookmarkStart w:id="126" w:name="keyboard-and-accessibility"/>
+    <w:bookmarkEnd w:id="126"/>
+    <w:bookmarkStart w:id="127" w:name="keyboard-and-accessibility"/>
     <w:p>
       <w:pPr>
         <w:pStyle w:val="Heading2"/>
@@ -8230,8 +8264,8 @@
         <w:t xml:space="preserve">The menu respects the system’s text size, light and dark appearance, and increased contrast.</w:t>
       </w:r>
     </w:p>
-    <w:bookmarkEnd w:id="126"/>
-    <w:bookmarkStart w:id="136" w:name="language"/>
+    <w:bookmarkEnd w:id="127"/>
+    <w:bookmarkStart w:id="137" w:name="language"/>
     <w:p>
       <w:pPr>
         <w:pStyle w:val="Heading2"/>
@@ -8563,7 +8597,7 @@
         </w:tc>
       </w:tr>
     </w:tbl>
-    <w:bookmarkStart w:id="127" w:name="follow-your-macs-language"/>
+    <w:bookmarkStart w:id="128" w:name="follow-your-macs-language"/>
     <w:p>
       <w:pPr>
         <w:pStyle w:val="Heading3"/>
@@ -8630,8 +8664,8 @@
         <w:t xml:space="preserve">For example, a Mac set to Italian uses Italian when DisplayHelp follows the system. An unsupported first language can fall back to another supported language in your preferred list.</w:t>
       </w:r>
     </w:p>
-    <w:bookmarkEnd w:id="127"/>
-    <w:bookmarkStart w:id="128" w:name="choose-a-language-inside-displayhelp"/>
+    <w:bookmarkEnd w:id="128"/>
+    <w:bookmarkStart w:id="129" w:name="choose-a-language-inside-displayhelp"/>
     <w:p>
       <w:pPr>
         <w:pStyle w:val="Heading3"/>
@@ -8757,8 +8791,8 @@
         <w:t xml:space="preserve">to return to the Mac’s preferences. The globe is temporarily unavailable while display changes, profile checks or fixes are running.</w:t>
       </w:r>
     </w:p>
-    <w:bookmarkEnd w:id="128"/>
-    <w:bookmarkStart w:id="135" w:name="macos-settings-versus-the-in-app-globe"/>
+    <w:bookmarkEnd w:id="129"/>
+    <w:bookmarkStart w:id="136" w:name="macos-settings-versus-the-in-app-globe"/>
     <w:p>
       <w:pPr>
         <w:pStyle w:val="Heading3"/>
@@ -8953,18 +8987,18 @@
           <wp:inline>
             <wp:extent cx="1428750" cy="3171825"/>
             <wp:effectExtent b="0" l="0" r="0" t="0"/>
-            <wp:docPr descr="DisplayHelp globe menu showing Follow System and all eleven language choices" title="" id="130" name="Picture"/>
+            <wp:docPr descr="DisplayHelp globe menu showing Follow System and all eleven language choices" title="" id="131" name="Picture"/>
             <a:graphic>
               <a:graphicData uri="http://schemas.openxmlformats.org/drawingml/2006/picture">
                 <pic:pic>
                   <pic:nvPicPr>
-                    <pic:cNvPr descr="/Users/helpdesk/Developer/GitHub/DisplayHelp/docs/images/language-menu.png" id="131" name="Picture"/>
+                    <pic:cNvPr descr="/Users/helpdesk/Developer/GitHub/DisplayHelp/docs/images/language-menu.png" id="132" name="Picture"/>
                     <pic:cNvPicPr>
                       <a:picLocks noChangeArrowheads="1" noChangeAspect="1"/>
                     </pic:cNvPicPr>
                   </pic:nvPicPr>
                   <pic:blipFill>
-                    <a:blip r:embed="rId129"/>
+                    <a:blip r:embed="rId130"/>
                     <a:stretch>
                       <a:fillRect/>
                     </a:stretch>
@@ -9008,18 +9042,18 @@
           <wp:inline>
             <wp:extent cx="2476469" cy="2228822"/>
             <wp:effectExtent b="0" l="0" r="0" t="0"/>
-            <wp:docPr descr="Restart DisplayHelp to apply the app-only language selection, or choose Later" title="" id="133" name="Picture"/>
+            <wp:docPr descr="Restart DisplayHelp to apply the app-only language selection, or choose Later" title="" id="134" name="Picture"/>
             <a:graphic>
               <a:graphicData uri="http://schemas.openxmlformats.org/drawingml/2006/picture">
                 <pic:pic>
                   <pic:nvPicPr>
-                    <pic:cNvPr descr="/Users/helpdesk/Developer/GitHub/DisplayHelp/docs/images/language-confirmation.png" id="134" name="Picture"/>
+                    <pic:cNvPr descr="/Users/helpdesk/Developer/GitHub/DisplayHelp/docs/images/language-confirmation.png" id="135" name="Picture"/>
                     <pic:cNvPicPr>
                       <a:picLocks noChangeArrowheads="1" noChangeAspect="1"/>
                     </pic:cNvPicPr>
                   </pic:nvPicPr>
                   <pic:blipFill>
-                    <a:blip r:embed="rId132"/>
+                    <a:blip r:embed="rId133"/>
                     <a:stretch>
                       <a:fillRect/>
                     </a:stretch>
@@ -9079,10 +9113,10 @@
         <w:t xml:space="preserve">for Traditional Chinese and Arabic. Translation terminology has been checked against Apple documentation; independent native-speaker review remains pending.</w:t>
       </w:r>
     </w:p>
-    <w:bookmarkEnd w:id="135"/>
     <w:bookmarkEnd w:id="136"/>
     <w:bookmarkEnd w:id="137"/>
-    <w:bookmarkStart w:id="143" w:name="faq"/>
+    <w:bookmarkEnd w:id="138"/>
+    <w:bookmarkStart w:id="144" w:name="faq"/>
     <w:p>
       <w:pPr>
         <w:pStyle w:val="Heading1"/>
@@ -9106,7 +9140,26 @@
         <w:t xml:space="preserve"> </w:t>
       </w:r>
       <w:r>
-        <w:t xml:space="preserve">Yes. It never uses the network.</w:t>
+        <w:t xml:space="preserve">Yes. Display, audio and profile features never use the network. The only network request is</w:t>
+      </w:r>
+      <w:r>
+        <w:t xml:space="preserve"> </w:t>
+      </w:r>
+      <w:r>
+        <w:rPr>
+          <w:b/>
+          <w:bCs/>
+        </w:rPr>
+        <w:t xml:space="preserve">Check for Update…</w:t>
+      </w:r>
+      <w:r>
+        <w:t xml:space="preserve">,</w:t>
+      </w:r>
+      <w:r>
+        <w:t xml:space="preserve"> </w:t>
+      </w:r>
+      <w:r>
+        <w:t xml:space="preserve">which contacts GitHub when you click it and says so if the Mac is offline.</w:t>
       </w:r>
     </w:p>
     <w:p>
@@ -9132,6 +9185,47 @@
       <w:r>
         <w:t xml:space="preserve">marked with a lock also run as administrator. Display controls run as the logged-in user. The password dialog is macOS’s own; the app never sees the password.</w:t>
       </w:r>
+      <w:r>
+        <w:t xml:space="preserve"> </w:t>
+      </w:r>
+      <w:r>
+        <w:t xml:space="preserve">Installing an update needs one administrator approval per Mac for</w:t>
+      </w:r>
+      <w:r>
+        <w:t xml:space="preserve"> </w:t>
+      </w:r>
+      <w:r>
+        <w:rPr>
+          <w:b/>
+          <w:bCs/>
+        </w:rPr>
+        <w:t xml:space="preserve">DisplayHelp Updater</w:t>
+      </w:r>
+      <w:r>
+        <w:t xml:space="preserve">; after that, or when an MDM</w:t>
+      </w:r>
+      <w:r>
+        <w:t xml:space="preserve"> </w:t>
+      </w:r>
+      <w:r>
+        <w:t xml:space="preserve">profile pre-approves it, standard accounts can click</w:t>
+      </w:r>
+      <w:r>
+        <w:t xml:space="preserve"> </w:t>
+      </w:r>
+      <w:r>
+        <w:rPr>
+          <w:b/>
+          <w:bCs/>
+        </w:rPr>
+        <w:t xml:space="preserve">Install</w:t>
+      </w:r>
+      <w:r>
+        <w:t xml:space="preserve"> </w:t>
+      </w:r>
+      <w:r>
+        <w:t xml:space="preserve">themselves.</w:t>
+      </w:r>
     </w:p>
     <w:p>
       <w:pPr>
@@ -9142,6 +9236,203 @@
           <w:b/>
           <w:bCs/>
         </w:rPr>
+        <w:t xml:space="preserve">How do I update DisplayHelp?</w:t>
+      </w:r>
+      <w:r>
+        <w:t xml:space="preserve"> </w:t>
+      </w:r>
+      <w:r>
+        <w:t xml:space="preserve">Click</w:t>
+      </w:r>
+      <w:r>
+        <w:t xml:space="preserve"> </w:t>
+      </w:r>
+      <w:r>
+        <w:rPr>
+          <w:b/>
+          <w:bCs/>
+        </w:rPr>
+        <w:t xml:space="preserve">Check for Update…</w:t>
+      </w:r>
+      <w:r>
+        <w:t xml:space="preserve"> </w:t>
+      </w:r>
+      <w:r>
+        <w:t xml:space="preserve">beside Quit. It compares the newest GitHub release with your version.</w:t>
+      </w:r>
+      <w:r>
+        <w:t xml:space="preserve"> </w:t>
+      </w:r>
+      <w:r>
+        <w:rPr>
+          <w:b/>
+          <w:bCs/>
+        </w:rPr>
+        <w:t xml:space="preserve">Install</w:t>
+      </w:r>
+      <w:r>
+        <w:t xml:space="preserve"> </w:t>
+      </w:r>
+      <w:r>
+        <w:t xml:space="preserve">updates in</w:t>
+      </w:r>
+      <w:r>
+        <w:t xml:space="preserve"> </w:t>
+      </w:r>
+      <w:r>
+        <w:t xml:space="preserve">place through the approved DisplayHelp Updater helper;</w:t>
+      </w:r>
+      <w:r>
+        <w:t xml:space="preserve"> </w:t>
+      </w:r>
+      <w:r>
+        <w:rPr>
+          <w:b/>
+          <w:bCs/>
+        </w:rPr>
+        <w:t xml:space="preserve">Download</w:t>
+      </w:r>
+      <w:r>
+        <w:t xml:space="preserve"> </w:t>
+      </w:r>
+      <w:r>
+        <w:t xml:space="preserve">fetches the installer package for a manual install.</w:t>
+      </w:r>
+      <w:r>
+        <w:t xml:space="preserve"> </w:t>
+      </w:r>
+      <w:r>
+        <w:t xml:space="preserve">Homebrew users can run</w:t>
+      </w:r>
+      <w:r>
+        <w:t xml:space="preserve"> </w:t>
+      </w:r>
+      <w:r>
+        <w:rPr>
+          <w:rStyle w:val="VerbatimChar"/>
+        </w:rPr>
+        <w:t xml:space="preserve">brew upgrade --cask displayhelp</w:t>
+      </w:r>
+      <w:r>
+        <w:t xml:space="preserve"> </w:t>
+      </w:r>
+      <w:r>
+        <w:t xml:space="preserve">instead. Managed Macs usually get updates from their MDM.</w:t>
+      </w:r>
+    </w:p>
+    <w:p>
+      <w:pPr>
+        <w:pStyle w:val="BodyText"/>
+      </w:pPr>
+      <w:r>
+        <w:rPr>
+          <w:b/>
+          <w:bCs/>
+        </w:rPr>
+        <w:t xml:space="preserve">Can I install it with Homebrew?</w:t>
+      </w:r>
+      <w:r>
+        <w:t xml:space="preserve"> </w:t>
+      </w:r>
+      <w:r>
+        <w:t xml:space="preserve">Yes:</w:t>
+      </w:r>
+      <w:r>
+        <w:t xml:space="preserve"> </w:t>
+      </w:r>
+      <w:r>
+        <w:rPr>
+          <w:rStyle w:val="VerbatimChar"/>
+        </w:rPr>
+        <w:t xml:space="preserve">brew tap hov172/displayhelp</w:t>
+      </w:r>
+      <w:r>
+        <w:t xml:space="preserve">,</w:t>
+      </w:r>
+      <w:r>
+        <w:t xml:space="preserve"> </w:t>
+      </w:r>
+      <w:r>
+        <w:rPr>
+          <w:rStyle w:val="VerbatimChar"/>
+        </w:rPr>
+        <w:t xml:space="preserve">brew trust hov172/displayhelp</w:t>
+      </w:r>
+      <w:r>
+        <w:t xml:space="preserve">, then</w:t>
+      </w:r>
+      <w:r>
+        <w:t xml:space="preserve"> </w:t>
+      </w:r>
+      <w:r>
+        <w:rPr>
+          <w:rStyle w:val="VerbatimChar"/>
+        </w:rPr>
+        <w:t xml:space="preserve">brew install --cask displayhelp</w:t>
+      </w:r>
+      <w:r>
+        <w:t xml:space="preserve">. It runs the same</w:t>
+      </w:r>
+      <w:r>
+        <w:t xml:space="preserve"> </w:t>
+      </w:r>
+      <w:r>
+        <w:t xml:space="preserve">signed installer package, so the app and its login agent end up exactly as a manual install leaves them.</w:t>
+      </w:r>
+    </w:p>
+    <w:p>
+      <w:pPr>
+        <w:pStyle w:val="BodyText"/>
+      </w:pPr>
+      <w:r>
+        <w:rPr>
+          <w:b/>
+          <w:bCs/>
+        </w:rPr>
+        <w:t xml:space="preserve">Can IT skip the administrator approval for updates?</w:t>
+      </w:r>
+      <w:r>
+        <w:t xml:space="preserve"> </w:t>
+      </w:r>
+      <w:r>
+        <w:t xml:space="preserve">Yes. An MDM can pre-approve the login agent and DisplayHelp Updater with the Service Management profile in</w:t>
+      </w:r>
+      <w:r>
+        <w:t xml:space="preserve"> </w:t>
+      </w:r>
+      <w:r>
+        <w:rPr>
+          <w:rStyle w:val="VerbatimChar"/>
+        </w:rPr>
+        <w:t xml:space="preserve">examples/mdm</w:t>
+      </w:r>
+      <w:r>
+        <w:t xml:space="preserve">; see the</w:t>
+      </w:r>
+      <w:r>
+        <w:t xml:space="preserve"> </w:t>
+      </w:r>
+      <w:hyperlink r:id="rId119">
+        <w:r>
+          <w:rPr>
+            <w:rStyle w:val="Hyperlink"/>
+          </w:rPr>
+          <w:t xml:space="preserve">rollout guide</w:t>
+        </w:r>
+      </w:hyperlink>
+      <w:r>
+        <w:t xml:space="preserve">.</w:t>
+      </w:r>
+    </w:p>
+    <w:p>
+      <w:pPr>
+        <w:pStyle w:val="BodyText"/>
+      </w:pPr>
+      <w:r>
+        <w:rPr>
+          <w:b/>
+          <w:bCs/>
+        </w:rPr>
         <w:t xml:space="preserve">Will it change my displays without asking?</w:t>
       </w:r>
       <w:r>
@@ -9463,7 +9754,7 @@
       <w:r>
         <w:t xml:space="preserve"> </w:t>
       </w:r>
-      <w:hyperlink r:id="rId138">
+      <w:hyperlink r:id="rId139">
         <w:r>
           <w:rPr>
             <w:rStyle w:val="Hyperlink"/>
@@ -9600,7 +9891,7 @@
       <w:r>
         <w:t xml:space="preserve"> </w:t>
       </w:r>
-      <w:hyperlink r:id="rId139">
+      <w:hyperlink r:id="rId140">
         <w:r>
           <w:rPr>
             <w:rStyle w:val="Hyperlink"/>
@@ -10140,7 +10431,7 @@
       <w:r>
         <w:t xml:space="preserve"> </w:t>
       </w:r>
-      <w:hyperlink r:id="rId140">
+      <w:hyperlink r:id="rId141">
         <w:r>
           <w:rPr>
             <w:rStyle w:val="Hyperlink"/>
@@ -10442,7 +10733,7 @@
         <w:t xml:space="preserve">Place acts on the card you opened. Choosing “Built-in Display left of SAMSUNG” puts the laptop on the left and SAMSUNG on the right. To put SAMSUNG left of the laptop, open Place… on SAMSUNG’s card and choose it left of Built-in Display. The visible placement, alignment and rotation describe the actual setup.</w:t>
       </w:r>
     </w:p>
-    <w:bookmarkStart w:id="142" w:name="X659270d6f81ca5d909cf0b22b18d20410103a55"/>
+    <w:bookmarkStart w:id="143" w:name="X659270d6f81ca5d909cf0b22b18d20410103a55"/>
     <w:p>
       <w:pPr>
         <w:pStyle w:val="Heading2"/>
@@ -10485,7 +10776,7 @@
       <w:r>
         <w:t xml:space="preserve"> </w:t>
       </w:r>
-      <w:hyperlink r:id="rId141">
+      <w:hyperlink r:id="rId142">
         <w:r>
           <w:rPr>
             <w:rStyle w:val="Hyperlink"/>
@@ -10497,9 +10788,9 @@
         <w:t xml:space="preserve">.</w:t>
       </w:r>
     </w:p>
-    <w:bookmarkEnd w:id="142"/>
     <w:bookmarkEnd w:id="143"/>
-    <w:bookmarkStart w:id="192" w:name="troubleshooting"/>
+    <w:bookmarkEnd w:id="144"/>
+    <w:bookmarkStart w:id="193" w:name="troubleshooting"/>
     <w:p>
       <w:pPr>
         <w:pStyle w:val="Heading1"/>
@@ -10524,7 +10815,7 @@
       <w:r>
         <w:t xml:space="preserve"> </w:t>
       </w:r>
-      <w:hyperlink r:id="rId144">
+      <w:hyperlink r:id="rId145">
         <w:r>
           <w:rPr>
             <w:rStyle w:val="Hyperlink"/>
@@ -10545,7 +10836,7 @@
         <w:t xml:space="preserve">modes vary by Mac, cable and port.</w:t>
       </w:r>
     </w:p>
-    <w:bookmarkStart w:id="145" w:name="contents-1"/>
+    <w:bookmarkStart w:id="146" w:name="contents-1"/>
     <w:p>
       <w:pPr>
         <w:pStyle w:val="Heading2"/>
@@ -10663,8 +10954,8 @@
         </w:pict>
       </w:r>
     </w:p>
-    <w:bookmarkEnd w:id="145"/>
-    <w:bookmarkStart w:id="152" w:name="picture-and-layout"/>
+    <w:bookmarkEnd w:id="146"/>
+    <w:bookmarkStart w:id="153" w:name="picture-and-layout"/>
     <w:p>
       <w:pPr>
         <w:pStyle w:val="Heading2"/>
@@ -10673,7 +10964,7 @@
         <w:t xml:space="preserve">Picture and layout</w:t>
       </w:r>
     </w:p>
-    <w:bookmarkStart w:id="146" w:name="X82e123150de438f1c200291ce92a1676b84fa91"/>
+    <w:bookmarkStart w:id="147" w:name="X82e123150de438f1c200291ce92a1676b84fa91"/>
     <w:p>
       <w:pPr>
         <w:pStyle w:val="Heading3"/>
@@ -10735,8 +11026,8 @@
         <w:t xml:space="preserve">restarts the Dock after any display change that ends mirrored, once the burst of changes settles.</w:t>
       </w:r>
     </w:p>
-    <w:bookmarkEnd w:id="146"/>
-    <w:bookmarkStart w:id="147" w:name="Xfb0234130da404ecddbe50f67bb27c1554369e4"/>
+    <w:bookmarkEnd w:id="147"/>
+    <w:bookmarkStart w:id="148" w:name="Xfb0234130da404ecddbe50f67bb27c1554369e4"/>
     <w:p>
       <w:pPr>
         <w:pStyle w:val="Heading3"/>
@@ -10837,8 +11128,8 @@
         <w:t xml:space="preserve">wait for the confirmation deadline to revert instead of keeping it.</w:t>
       </w:r>
     </w:p>
-    <w:bookmarkEnd w:id="147"/>
-    <w:bookmarkStart w:id="148" w:name="everything-on-the-tv-is-tiny"/>
+    <w:bookmarkEnd w:id="148"/>
+    <w:bookmarkStart w:id="149" w:name="everything-on-the-tv-is-tiny"/>
     <w:p>
       <w:pPr>
         <w:pStyle w:val="Heading3"/>
@@ -10900,8 +11191,8 @@
         <w:t xml:space="preserve">1920×1080 HiDPI, which is sharp and readable.</w:t>
       </w:r>
     </w:p>
-    <w:bookmarkEnd w:id="148"/>
-    <w:bookmarkStart w:id="149" w:name="X5f2d60a8f5ce5bb701abc8287569eab4a33a7a1"/>
+    <w:bookmarkEnd w:id="149"/>
+    <w:bookmarkStart w:id="150" w:name="X5f2d60a8f5ce5bb701abc8287569eab4a33a7a1"/>
     <w:p>
       <w:pPr>
         <w:pStyle w:val="Heading3"/>
@@ -10982,8 +11273,8 @@
         <w:t xml:space="preserve">identical.</w:t>
       </w:r>
     </w:p>
-    <w:bookmarkEnd w:id="149"/>
-    <w:bookmarkStart w:id="150" w:name="the-laptop-and-tv-are-on-different-sizes"/>
+    <w:bookmarkEnd w:id="150"/>
+    <w:bookmarkStart w:id="151" w:name="the-laptop-and-tv-are-on-different-sizes"/>
     <w:p>
       <w:pPr>
         <w:pStyle w:val="Heading3"/>
@@ -11045,8 +11336,8 @@
         <w:t xml:space="preserve">was not running. The app re-mirrors the set, which makes macOS put the laptop back on the TV’s size.</w:t>
       </w:r>
     </w:p>
-    <w:bookmarkEnd w:id="150"/>
-    <w:bookmarkStart w:id="151" w:name="X6dfc21217b62a1ebab5e2e08781264a2700369e"/>
+    <w:bookmarkEnd w:id="151"/>
+    <w:bookmarkStart w:id="152" w:name="X6dfc21217b62a1ebab5e2e08781264a2700369e"/>
     <w:p>
       <w:pPr>
         <w:pStyle w:val="Heading3"/>
@@ -11105,9 +11396,9 @@
         <w:t xml:space="preserve">.</w:t>
       </w:r>
     </w:p>
-    <w:bookmarkEnd w:id="151"/>
     <w:bookmarkEnd w:id="152"/>
-    <w:bookmarkStart w:id="157" w:name="connection"/>
+    <w:bookmarkEnd w:id="153"/>
+    <w:bookmarkStart w:id="158" w:name="connection"/>
     <w:p>
       <w:pPr>
         <w:pStyle w:val="Heading2"/>
@@ -11116,7 +11407,7 @@
         <w:t xml:space="preserve">Connection</w:t>
       </w:r>
     </w:p>
-    <w:bookmarkStart w:id="153" w:name="Xbf17b323036102cb0637ec4097597e7144c58a4"/>
+    <w:bookmarkStart w:id="154" w:name="Xbf17b323036102cb0637ec4097597e7144c58a4"/>
     <w:p>
       <w:pPr>
         <w:pStyle w:val="Heading3"/>
@@ -11247,8 +11538,8 @@
         <w:t xml:space="preserve">reconnect; it never disconnects anything.</w:t>
       </w:r>
     </w:p>
-    <w:bookmarkEnd w:id="153"/>
-    <w:bookmarkStart w:id="154" w:name="Xd7137ed43a1016018c8568ef1ae65dba0c487dc"/>
+    <w:bookmarkEnd w:id="154"/>
+    <w:bookmarkStart w:id="155" w:name="Xd7137ed43a1016018c8568ef1ae65dba0c487dc"/>
     <w:p>
       <w:pPr>
         <w:pStyle w:val="Heading3"/>
@@ -11281,8 +11572,8 @@
         <w:t xml:space="preserve">saved data was removed by the uninstaller with purge on. Answer once and it is remembered again.</w:t>
       </w:r>
     </w:p>
-    <w:bookmarkEnd w:id="154"/>
-    <w:bookmarkStart w:id="155" w:name="X06ef9e1fb6197e69548f8b3ba27193891f41d25"/>
+    <w:bookmarkEnd w:id="155"/>
+    <w:bookmarkStart w:id="156" w:name="X06ef9e1fb6197e69548f8b3ba27193891f41d25"/>
     <w:p>
       <w:pPr>
         <w:pStyle w:val="Heading3"/>
@@ -11333,8 +11624,8 @@
         <w:t xml:space="preserve">display’s name.</w:t>
       </w:r>
     </w:p>
-    <w:bookmarkEnd w:id="155"/>
-    <w:bookmarkStart w:id="156" w:name="only-the-built-in-display-is-found"/>
+    <w:bookmarkEnd w:id="156"/>
+    <w:bookmarkStart w:id="157" w:name="only-the-built-in-display-is-found"/>
     <w:p>
       <w:pPr>
         <w:pStyle w:val="Heading3"/>
@@ -11380,9 +11671,9 @@
         <w:t xml:space="preserve">Mac’s own port.</w:t>
       </w:r>
     </w:p>
-    <w:bookmarkEnd w:id="156"/>
     <w:bookmarkEnd w:id="157"/>
-    <w:bookmarkStart w:id="174" w:name="controls-and-buttons"/>
+    <w:bookmarkEnd w:id="158"/>
+    <w:bookmarkStart w:id="175" w:name="controls-and-buttons"/>
     <w:p>
       <w:pPr>
         <w:pStyle w:val="Heading2"/>
@@ -11391,7 +11682,7 @@
         <w:t xml:space="preserve">Controls and buttons</w:t>
       </w:r>
     </w:p>
-    <w:bookmarkStart w:id="158" w:name="X189378a9b5c4c2dd79bd2dcb3196528111c6a3b"/>
+    <w:bookmarkStart w:id="159" w:name="X189378a9b5c4c2dd79bd2dcb3196528111c6a3b"/>
     <w:p>
       <w:pPr>
         <w:pStyle w:val="Heading3"/>
@@ -11424,8 +11715,8 @@
         <w:t xml:space="preserve">The status icon can still be the grey ⓘ when the current refresh rate is below 50 Hz.</w:t>
       </w:r>
     </w:p>
-    <w:bookmarkEnd w:id="158"/>
-    <w:bookmarkStart w:id="159" w:name="X34be2b1480a8d411d8a0e7512016d5fcd4943ca"/>
+    <w:bookmarkEnd w:id="159"/>
+    <w:bookmarkStart w:id="160" w:name="X34be2b1480a8d411d8a0e7512016d5fcd4943ca"/>
     <w:p>
       <w:pPr>
         <w:pStyle w:val="Heading3"/>
@@ -11534,8 +11825,8 @@
         <w:t xml:space="preserve">Recommendations prefer 50 Hz or better, but fall back when none is available.</w:t>
       </w:r>
     </w:p>
-    <w:bookmarkEnd w:id="159"/>
-    <w:bookmarkStart w:id="160" w:name="X44969330943e9cfead843a705f2ee9898e19689"/>
+    <w:bookmarkEnd w:id="160"/>
+    <w:bookmarkStart w:id="161" w:name="X44969330943e9cfead843a705f2ee9898e19689"/>
     <w:p>
       <w:pPr>
         <w:pStyle w:val="Heading3"/>
@@ -11602,8 +11893,8 @@
         <w:t xml:space="preserve">also requires an exact, unambiguous set and must be enabled explicitly.</w:t>
       </w:r>
     </w:p>
-    <w:bookmarkEnd w:id="160"/>
-    <w:bookmarkStart w:id="161" w:name="Xed348068975c5041e0b91f43ed9499efff73969"/>
+    <w:bookmarkEnd w:id="161"/>
+    <w:bookmarkStart w:id="162" w:name="Xed348068975c5041e0b91f43ed9499efff73969"/>
     <w:p>
       <w:pPr>
         <w:pStyle w:val="Heading3"/>
@@ -11688,8 +11979,8 @@
         <w:t xml:space="preserve">yet; renaming monitors or resetting app data will not resolve the ambiguity.</w:t>
       </w:r>
     </w:p>
-    <w:bookmarkEnd w:id="161"/>
-    <w:bookmarkStart w:id="162" w:name="X878a2dd9260edfb41d38e8e1459534d630bb9b6"/>
+    <w:bookmarkEnd w:id="162"/>
+    <w:bookmarkStart w:id="163" w:name="X878a2dd9260edfb41d38e8e1459534d630bb9b6"/>
     <w:p>
       <w:pPr>
         <w:pStyle w:val="Heading3"/>
@@ -11789,7 +12080,7 @@
       <w:r>
         <w:t xml:space="preserve"> </w:t>
       </w:r>
-      <w:hyperlink r:id="rId138">
+      <w:hyperlink r:id="rId139">
         <w:r>
           <w:rPr>
             <w:rStyle w:val="Hyperlink"/>
@@ -11801,8 +12092,8 @@
         <w:t xml:space="preserve">.</w:t>
       </w:r>
     </w:p>
-    <w:bookmarkEnd w:id="162"/>
-    <w:bookmarkStart w:id="163" w:name="X6213711d1bf40f750ef4ad4626da1a1dc5b9f77"/>
+    <w:bookmarkEnd w:id="163"/>
+    <w:bookmarkStart w:id="164" w:name="X6213711d1bf40f750ef4ad4626da1a1dc5b9f77"/>
     <w:p>
       <w:pPr>
         <w:pStyle w:val="Heading3"/>
@@ -11841,8 +12132,8 @@
         <w:t xml:space="preserve">Closing the menu does not dismiss the floating confirmation window.</w:t>
       </w:r>
     </w:p>
-    <w:bookmarkEnd w:id="163"/>
-    <w:bookmarkStart w:id="164" w:name="revert-could-not-restore-every-setting"/>
+    <w:bookmarkEnd w:id="164"/>
+    <w:bookmarkStart w:id="165" w:name="revert-could-not-restore-every-setting"/>
     <w:p>
       <w:pPr>
         <w:pStyle w:val="Heading3"/>
@@ -11913,8 +12204,8 @@
         <w:t xml:space="preserve">previous reconnect preferences and reports incomplete recovery rather than treating it as success.</w:t>
       </w:r>
     </w:p>
-    <w:bookmarkEnd w:id="164"/>
-    <w:bookmarkStart w:id="165" w:name="favorite-shortcuts-do-nothing"/>
+    <w:bookmarkEnd w:id="165"/>
+    <w:bookmarkStart w:id="166" w:name="favorite-shortcuts-do-nothing"/>
     <w:p>
       <w:pPr>
         <w:pStyle w:val="Heading3"/>
@@ -12051,8 +12342,8 @@
         <w:t xml:space="preserve">applying anything.</w:t>
       </w:r>
     </w:p>
-    <w:bookmarkEnd w:id="165"/>
-    <w:bookmarkStart w:id="166" w:name="the-profile-library-cannot-be-loaded"/>
+    <w:bookmarkEnd w:id="166"/>
+    <w:bookmarkStart w:id="167" w:name="the-profile-library-cannot-be-loaded"/>
     <w:p>
       <w:pPr>
         <w:pStyle w:val="Heading3"/>
@@ -12159,8 +12450,8 @@
         <w:t xml:space="preserve">until recovery so the unreadable original cannot silently be overwritten.</w:t>
       </w:r>
     </w:p>
-    <w:bookmarkEnd w:id="166"/>
-    <w:bookmarkStart w:id="167" w:name="reconnect-preferences-could-not-be-saved"/>
+    <w:bookmarkEnd w:id="167"/>
+    <w:bookmarkStart w:id="168" w:name="reconnect-preferences-could-not-be-saved"/>
     <w:p>
       <w:pPr>
         <w:pStyle w:val="Heading3"/>
@@ -12230,8 +12521,8 @@
         <w:t xml:space="preserve">error does not prove the hardware change failed, but that change may not be recalled on reconnect.</w:t>
       </w:r>
     </w:p>
-    <w:bookmarkEnd w:id="167"/>
-    <w:bookmarkStart w:id="168" w:name="Xe0ceaf7c29d5e5d05459c0fea4bc9595c94c02e"/>
+    <w:bookmarkEnd w:id="168"/>
+    <w:bookmarkStart w:id="169" w:name="Xe0ceaf7c29d5e5d05459c0fea4bc9595c94c02e"/>
     <w:p>
       <w:pPr>
         <w:pStyle w:val="Heading3"/>
@@ -12304,8 +12595,8 @@
         <w:t xml:space="preserve">controls can still work.</w:t>
       </w:r>
     </w:p>
-    <w:bookmarkEnd w:id="168"/>
-    <w:bookmarkStart w:id="169" w:name="hdcp-shows-unavailable"/>
+    <w:bookmarkEnd w:id="169"/>
+    <w:bookmarkStart w:id="170" w:name="hdcp-shows-unavailable"/>
     <w:p>
       <w:pPr>
         <w:pStyle w:val="Heading3"/>
@@ -12420,8 +12711,8 @@
         <w:t xml:space="preserve">for macOS, or no answer within three seconds. It is not a statement about the display.</w:t>
       </w:r>
     </w:p>
-    <w:bookmarkEnd w:id="169"/>
-    <w:bookmarkStart w:id="170" w:name="hdcp-shows-unprotected-or-negotiating"/>
+    <w:bookmarkEnd w:id="170"/>
+    <w:bookmarkStart w:id="171" w:name="hdcp-shows-unprotected-or-negotiating"/>
     <w:p>
       <w:pPr>
         <w:pStyle w:val="Heading3"/>
@@ -12501,8 +12792,8 @@
         <w:t xml:space="preserve">on DisplayPort connections the topology sentence reports whether a repeater is present and, for an HDCP 2 repeater, any limit flags it sets.</w:t>
       </w:r>
     </w:p>
-    <w:bookmarkEnd w:id="170"/>
-    <w:bookmarkStart w:id="171" w:name="no-rotation-or-underscan-row"/>
+    <w:bookmarkEnd w:id="171"/>
+    <w:bookmarkStart w:id="172" w:name="no-rotation-or-underscan-row"/>
     <w:p>
       <w:pPr>
         <w:pStyle w:val="Heading3"/>
@@ -12541,8 +12832,8 @@
         <w:t xml:space="preserve">monitor that can swivel exposes software rotation through this connection.</w:t>
       </w:r>
     </w:p>
-    <w:bookmarkEnd w:id="171"/>
-    <w:bookmarkStart w:id="172" w:name="X8d7085585af9f1b47330aa5031ccc1f3421da57"/>
+    <w:bookmarkEnd w:id="172"/>
+    <w:bookmarkStart w:id="173" w:name="X8d7085585af9f1b47330aa5031ccc1f3421da57"/>
     <w:p>
       <w:pPr>
         <w:pStyle w:val="Heading3"/>
@@ -12581,8 +12872,8 @@
         <w:t xml:space="preserve">Settings; the app will keep it and show it in the picker as the current size.</w:t>
       </w:r>
     </w:p>
-    <w:bookmarkEnd w:id="172"/>
-    <w:bookmarkStart w:id="173" w:name="a-custom-fix-does-not-appear"/>
+    <w:bookmarkEnd w:id="173"/>
+    <w:bookmarkStart w:id="174" w:name="a-custom-fix-does-not-appear"/>
     <w:p>
       <w:pPr>
         <w:pStyle w:val="Heading3"/>
@@ -12688,9 +12979,9 @@
         <w:t xml:space="preserve">line.</w:t>
       </w:r>
     </w:p>
-    <w:bookmarkEnd w:id="173"/>
     <w:bookmarkEnd w:id="174"/>
-    <w:bookmarkStart w:id="179" w:name="errors-in-recent-events"/>
+    <w:bookmarkEnd w:id="175"/>
+    <w:bookmarkStart w:id="180" w:name="errors-in-recent-events"/>
     <w:p>
       <w:pPr>
         <w:pStyle w:val="Heading2"/>
@@ -12699,7 +12990,7 @@
         <w:t xml:space="preserve">Errors in Recent Events</w:t>
       </w:r>
     </w:p>
-    <w:bookmarkStart w:id="175" w:name="applyfailed-with-cgerror-1001"/>
+    <w:bookmarkStart w:id="176" w:name="applyfailed-with-cgerror-1001"/>
     <w:p>
       <w:pPr>
         <w:pStyle w:val="Heading3"/>
@@ -12760,8 +13051,8 @@
         <w:t xml:space="preserve">.</w:t>
       </w:r>
     </w:p>
-    <w:bookmarkEnd w:id="175"/>
-    <w:bookmarkStart w:id="176" w:name="applyfailed-with-cgerror-1007"/>
+    <w:bookmarkEnd w:id="176"/>
+    <w:bookmarkStart w:id="177" w:name="applyfailed-with-cgerror-1007"/>
     <w:p>
       <w:pPr>
         <w:pStyle w:val="Heading3"/>
@@ -12803,8 +13094,8 @@
         <w:t xml:space="preserve">a reconnect clears it.</w:t>
       </w:r>
     </w:p>
-    <w:bookmarkEnd w:id="176"/>
-    <w:bookmarkStart w:id="177" w:name="applyfailed-with-preset-mode-unavailable"/>
+    <w:bookmarkEnd w:id="177"/>
+    <w:bookmarkStart w:id="178" w:name="applyfailed-with-preset-mode-unavailable"/>
     <w:p>
       <w:pPr>
         <w:pStyle w:val="Heading3"/>
@@ -12852,8 +13143,8 @@
         <w:t xml:space="preserve">size the picker now hides). Pick a size once and the preset is replaced.</w:t>
       </w:r>
     </w:p>
-    <w:bookmarkEnd w:id="177"/>
-    <w:bookmarkStart w:id="178" w:name="scriptfailed"/>
+    <w:bookmarkEnd w:id="178"/>
+    <w:bookmarkStart w:id="179" w:name="scriptfailed"/>
     <w:p>
       <w:pPr>
         <w:pStyle w:val="Heading3"/>
@@ -12883,9 +13174,9 @@
         <w:t xml:space="preserve">A fix script exited non-zero. The detail holds the exit code and the last line of its output.</w:t>
       </w:r>
     </w:p>
-    <w:bookmarkEnd w:id="178"/>
     <w:bookmarkEnd w:id="179"/>
-    <w:bookmarkStart w:id="183" w:name="the-app-itself"/>
+    <w:bookmarkEnd w:id="180"/>
+    <w:bookmarkStart w:id="184" w:name="the-app-itself"/>
     <w:p>
       <w:pPr>
         <w:pStyle w:val="Heading2"/>
@@ -12894,7 +13185,7 @@
         <w:t xml:space="preserve">The app itself</w:t>
       </w:r>
     </w:p>
-    <w:bookmarkStart w:id="180" w:name="X9b1f4ba64c8cc24cd6a73bb963e8fd140d5a5ad"/>
+    <w:bookmarkStart w:id="181" w:name="X9b1f4ba64c8cc24cd6a73bb963e8fd140d5a5ad"/>
     <w:p>
       <w:pPr>
         <w:pStyle w:val="Heading3"/>
@@ -12947,8 +13238,8 @@
         <w:t xml:space="preserve">WindowServer’s own display database is corrupt. The reset deletes it and macOS rebuilds it.</w:t>
       </w:r>
     </w:p>
-    <w:bookmarkEnd w:id="180"/>
-    <w:bookmarkStart w:id="181" w:name="X62c7b447ec07287f68a9b85ae335e30731aac00"/>
+    <w:bookmarkEnd w:id="181"/>
+    <w:bookmarkStart w:id="182" w:name="X62c7b447ec07287f68a9b85ae335e30731aac00"/>
     <w:p>
       <w:pPr>
         <w:pStyle w:val="Heading3"/>
@@ -13065,8 +13356,8 @@
         <w:t xml:space="preserve">in Console.</w:t>
       </w:r>
     </w:p>
-    <w:bookmarkEnd w:id="181"/>
-    <w:bookmarkStart w:id="182" w:name="the-icon-is-not-in-the-menu-bar"/>
+    <w:bookmarkEnd w:id="182"/>
+    <w:bookmarkStart w:id="183" w:name="the-icon-is-not-in-the-menu-bar"/>
     <w:p>
       <w:pPr>
         <w:pStyle w:val="Heading3"/>
@@ -13105,9 +13396,9 @@
         <w:t xml:space="preserve">. If it no longer starts at login, turn DisplayHelp back on in System Settings › General › Login Items › Allow in the Background.</w:t>
       </w:r>
     </w:p>
-    <w:bookmarkEnd w:id="182"/>
     <w:bookmarkEnd w:id="183"/>
-    <w:bookmarkStart w:id="185" w:name="collecting-diagnostics-for-the-helpdesk"/>
+    <w:bookmarkEnd w:id="184"/>
+    <w:bookmarkStart w:id="186" w:name="collecting-diagnostics-for-the-helpdesk"/>
     <w:p>
       <w:pPr>
         <w:pStyle w:val="Heading2"/>
@@ -13544,7 +13835,7 @@
         <w:t xml:space="preserve">questions.</w:t>
       </w:r>
     </w:p>
-    <w:bookmarkStart w:id="184" w:name="X5e31aa226ff031c45db4ee0abd5206d87407bf1"/>
+    <w:bookmarkStart w:id="185" w:name="X5e31aa226ff031c45db4ee0abd5206d87407bf1"/>
     <w:p>
       <w:pPr>
         <w:pStyle w:val="Heading3"/>
@@ -13936,9 +14227,9 @@
         <w:t xml:space="preserve">that resets macOS display configuration.</w:t>
       </w:r>
     </w:p>
-    <w:bookmarkEnd w:id="184"/>
     <w:bookmarkEnd w:id="185"/>
-    <w:bookmarkStart w:id="186" w:name="X6be06324594e8636178a21782f04ed856eaf899"/>
+    <w:bookmarkEnd w:id="186"/>
+    <w:bookmarkStart w:id="187" w:name="X6be06324594e8636178a21782f04ed856eaf899"/>
     <w:p>
       <w:pPr>
         <w:pStyle w:val="Heading2"/>
@@ -13985,8 +14276,8 @@
         <w:t xml:space="preserve">change if the installer reports that DisplayHelp could not close, quit the app, then rerun the installer.</w:t>
       </w:r>
     </w:p>
-    <w:bookmarkEnd w:id="186"/>
-    <w:bookmarkStart w:id="187" w:name="the-menu-looks-too-short"/>
+    <w:bookmarkEnd w:id="187"/>
+    <w:bookmarkStart w:id="188" w:name="the-menu-looks-too-short"/>
     <w:p>
       <w:pPr>
         <w:pStyle w:val="Heading2"/>
@@ -14015,8 +14306,8 @@
         <w:t xml:space="preserve">labeled with both screen numbers because both screens share a desktop.</w:t>
       </w:r>
     </w:p>
-    <w:bookmarkEnd w:id="187"/>
-    <w:bookmarkStart w:id="188" w:name="Xf9170cca88befcfcd23a9345b9e4a973df9f439"/>
+    <w:bookmarkEnd w:id="188"/>
+    <w:bookmarkStart w:id="189" w:name="Xf9170cca88befcfcd23a9345b9e4a973df9f439"/>
     <w:p>
       <w:pPr>
         <w:pStyle w:val="Heading2"/>
@@ -14046,8 +14337,8 @@
         <w:t xml:space="preserve">. Use Extend for independent desktops. Labels disappear after five seconds or a display-configuration change; click Identify Displays again to show them. The button appears beneath Screen Layout when an external display is detected. It does not request screen-recording access or capture desktop content.</w:t>
       </w:r>
     </w:p>
-    <w:bookmarkEnd w:id="188"/>
-    <w:bookmarkStart w:id="190" w:name="X5adf6dd4b75cee570ca37404475ada2ad2e72b3"/>
+    <w:bookmarkEnd w:id="189"/>
+    <w:bookmarkStart w:id="191" w:name="X5adf6dd4b75cee570ca37404475ada2ad2e72b3"/>
     <w:p>
       <w:pPr>
         <w:pStyle w:val="Heading2"/>
@@ -14096,7 +14387,7 @@
         <w:t xml:space="preserve">If an audio device changes while you adjust it, the app refuses the stale adjustment and asks you to use the newly selected output. Failed writes show the current readback and an explanation. No saved display profile is overwritten by an output-volume adjustment.</w:t>
       </w:r>
     </w:p>
-    <w:bookmarkStart w:id="189" w:name="placement-appears-reversed"/>
+    <w:bookmarkStart w:id="190" w:name="placement-appears-reversed"/>
     <w:p>
       <w:pPr>
         <w:pStyle w:val="Heading3"/>
@@ -14142,9 +14433,9 @@
         <w:t xml:space="preserve">, then alignment. Left on the built-in card means the opposite relationship. Check the visible readout and preview, then Keep Changes. For a failed move, share Copy Diagnostics immediately so its latest 20 events include the request and result.</w:t>
       </w:r>
     </w:p>
-    <w:bookmarkEnd w:id="189"/>
     <w:bookmarkEnd w:id="190"/>
-    <w:bookmarkStart w:id="191" w:name="the-app-uses-an-unexpected-language"/>
+    <w:bookmarkEnd w:id="191"/>
+    <w:bookmarkStart w:id="192" w:name="the-app-uses-an-unexpected-language"/>
     <w:p>
       <w:pPr>
         <w:pStyle w:val="Heading2"/>
@@ -14205,7 +14496,7 @@
       <w:r>
         <w:t xml:space="preserve"> </w:t>
       </w:r>
-      <w:hyperlink r:id="rId141">
+      <w:hyperlink r:id="rId142">
         <w:r>
           <w:rPr>
             <w:rStyle w:val="Hyperlink"/>
@@ -14217,8 +14508,8 @@
         <w:t xml:space="preserve">. Choosing Later saves the selection but keeps the current process in its existing language until you quit and reopen DisplayHelp.</w:t>
       </w:r>
     </w:p>
-    <w:bookmarkEnd w:id="191"/>
     <w:bookmarkEnd w:id="192"/>
+    <w:bookmarkEnd w:id="193"/>
     <w:sectPr>
       <w:footnotePr>
         <w:numRestart w:val="eachSect"/>

</xml_diff>